<commit_message>
refactor: update feasibility review documents and improve formatting
</commit_message>
<xml_diff>
--- a/recognition/oasis_brain_analysis/evidence/COMP3710_Midpoint_Feasibility_Review.docx
+++ b/recognition/oasis_brain_analysis/evidence/COMP3710_Midpoint_Feasibility_Review.docx
@@ -23,7 +23,7 @@
       <w:r>
         <w:rPr>
           <w:i/>
-          <w:sz w:val="18"/>
+          <w:sz w:val="20"/>
         </w:rPr>
         <w:t>Current implemented module: baseline versus improved 2D U-Net tissue segmentation</w:t>
       </w:r>
@@ -53,7 +53,7 @@
             <w:r>
               <w:rPr>
                 <w:b w:val="0"/>
-                <w:sz w:val="16"/>
+                <w:sz w:val="18"/>
               </w:rPr>
               <w:t>Dataset audit</w:t>
               <w:br/>
@@ -74,7 +74,7 @@
             <w:r>
               <w:rPr>
                 <w:b w:val="0"/>
-                <w:sz w:val="16"/>
+                <w:sz w:val="18"/>
               </w:rPr>
               <w:t>Geometry</w:t>
               <w:br/>
@@ -95,7 +95,7 @@
             <w:r>
               <w:rPr>
                 <w:b w:val="0"/>
-                <w:sz w:val="16"/>
+                <w:sz w:val="18"/>
               </w:rPr>
               <w:t>Labels</w:t>
               <w:br/>
@@ -118,7 +118,7 @@
             <w:r>
               <w:rPr>
                 <w:b w:val="0"/>
-                <w:sz w:val="16"/>
+                <w:sz w:val="18"/>
               </w:rPr>
               <w:t>Split protocol</w:t>
               <w:br/>
@@ -139,7 +139,7 @@
             <w:r>
               <w:rPr>
                 <w:b w:val="0"/>
-                <w:sz w:val="16"/>
+                <w:sz w:val="18"/>
               </w:rPr>
               <w:t>Smoke test</w:t>
               <w:br/>
@@ -160,7 +160,7 @@
             <w:r>
               <w:rPr>
                 <w:b w:val="0"/>
-                <w:sz w:val="16"/>
+                <w:sz w:val="18"/>
               </w:rPr>
               <w:t>Consultation status</w:t>
               <w:br/>
@@ -178,7 +178,7 @@
         <w:rPr>
           <w:b/>
           <w:color w:val="1F4E79"/>
-          <w:sz w:val="19"/>
+          <w:sz w:val="20"/>
         </w:rPr>
         <w:t>Purpose and decision requested</w:t>
       </w:r>
@@ -189,9 +189,9 @@
       </w:pPr>
       <w:r>
         <w:rPr>
-          <w:sz w:val="16"/>
+          <w:sz w:val="18"/>
         </w:rPr>
-        <w:t>This prototype segments preprocessed grayscale OASIS MRI slices into four tissue classes for human review. I request confirmation that the Easy-difficulty scope, the subject-disjoint comparison, and the stated acceptance criteria are appropriate before full training.</w:t>
+        <w:t>Research question: on the same subject-disjoint held-out set, can residual encoding, attention-gated skips and dropout improve class-wise tissue segmentation enough to justify their resource cost? I request confirmation that the Easy-difficulty scope and acceptance criteria are appropriate before full training.</w:t>
       </w:r>
     </w:p>
     <w:p>
@@ -202,7 +202,7 @@
         <w:rPr>
           <w:b/>
           <w:color w:val="1F4E79"/>
-          <w:sz w:val="19"/>
+          <w:sz w:val="20"/>
         </w:rPr>
         <w:t>Method and acceptance criteria</w:t>
       </w:r>
@@ -213,7 +213,7 @@
       </w:pPr>
       <w:r>
         <w:rPr>
-          <w:sz w:val="16"/>
+          <w:sz w:val="18"/>
         </w:rPr>
         <w:t>Both models will use the same saved seed-42 subject-level manifest. The baseline is a plain 2D U-Net; the proposed model adds residual encoding, attention-gated skips and bottleneck dropout. Acceptance evidence: no subject overlap; four-class logits; class-wise held-out Dice/IoU; parameter, VRAM and inference records; and 3-5 ranked FP/FN failure panels. The course target is Dice &gt;= 0.90 per tissue label.</w:t>
       </w:r>
@@ -226,7 +226,7 @@
         <w:rPr>
           <w:b/>
           <w:color w:val="1F4E79"/>
-          <w:sz w:val="19"/>
+          <w:sz w:val="20"/>
         </w:rPr>
         <w:t>Verified local evidence</w:t>
       </w:r>
@@ -237,9 +237,9 @@
       </w:pPr>
       <w:r>
         <w:rPr>
-          <w:sz w:val="16"/>
+          <w:sz w:val="18"/>
         </w:rPr>
-        <w:t>Read-only audit of the local source found 11,328 aligned image/mask pairs from 354 subjects. All pairs are 256 x 256. Raw mask pixel counts are 0: 536,466,114, 85: 41,266,731, 170: 85,030,267, 255: 79,628,696; all map to classes 0-3. Four deterministic audit samples were saved. Unit tests cover nested pairing, subject allocation, encoded-label remapping, and the audit manifest.</w:t>
+        <w:t>Read-only audit of the local source found 11,328 aligned image/mask pairs from 354 subjects. Every pair is 256 x 256. The four observed raw codes (0, 85, 170 and 255) map unambiguously to classes 0-3. Four deterministic audit samples were saved. Unit tests cover nested pairing, subject allocation, encoded-label remapping, and the audit manifest.</w:t>
       </w:r>
     </w:p>
     <w:p>
@@ -250,7 +250,7 @@
         <w:rPr>
           <w:b/>
           <w:color w:val="1F4E79"/>
-          <w:sz w:val="19"/>
+          <w:sz w:val="20"/>
         </w:rPr>
         <w:t>Smoke run: evidence of execution, not model quality</w:t>
       </w:r>
@@ -261,7 +261,7 @@
       </w:pPr>
       <w:r>
         <w:rPr>
-          <w:sz w:val="16"/>
+          <w:sz w:val="18"/>
         </w:rPr>
         <w:t>A local GPU baseline smoke run recorded PyTorch 2.11.0+cu128 on cuda: one epoch, 8 held-out cases, 1,927,940 trainable parameters, 0.088 s inference, and 284.6 MB peak VRAM. Held-out mean Dice = 0.0182; mean IoU = 0.0094. These deliberately small-run values validate the pipeline and failure-reporting route only; they do not support a performance claim.</w:t>
       </w:r>
@@ -274,7 +274,7 @@
         <w:rPr>
           <w:b/>
           <w:color w:val="1F4E79"/>
-          <w:sz w:val="19"/>
+          <w:sz w:val="20"/>
         </w:rPr>
         <w:t>Risks, budget and fallback</w:t>
       </w:r>
@@ -285,7 +285,7 @@
       </w:pPr>
       <w:r>
         <w:rPr>
-          <w:sz w:val="16"/>
+          <w:sz w:val="18"/>
         </w:rPr>
         <w:t>Risks: label imbalance, memory demand, thin tissue boundaries and a high mean masking class failures. Budget: train baseline and improved models on the identical full manifest; preserve checkpoints, learning curves, JSON metrics and 3-5 failure panels. Fallback: retain the simpler baseline if the improved model does not show a class-wise and qualitative benefit at acceptable resource cost.</w:t>
       </w:r>
@@ -298,20 +298,66 @@
         <w:rPr>
           <w:b/>
           <w:color w:val="1F4E79"/>
-          <w:sz w:val="19"/>
+          <w:sz w:val="20"/>
         </w:rPr>
         <w:t>Questions for tutor confirmation</w:t>
       </w:r>
     </w:p>
     <w:p>
       <w:pPr>
-        <w:spacing w:after="0" w:line="240" w:lineRule="auto"/>
+        <w:spacing w:after="40" w:line="240" w:lineRule="auto"/>
+        <w:ind w:left="115" w:hanging="115"/>
       </w:pPr>
       <w:r>
         <w:rPr>
-          <w:sz w:val="16"/>
+          <w:b/>
+          <w:sz w:val="18"/>
         </w:rPr>
-        <w:t>1. Confirm the Easy scope and the four-class 2D OASIS target.  2. Confirm Dice &gt;= 0.90 per label as the evaluation target and whether background is reported separately.  3. Confirm the required training budget and acceptable evidence for the midpoint record.</w:t>
+        <w:t xml:space="preserve">1. </w:t>
+      </w:r>
+      <w:r>
+        <w:rPr>
+          <w:sz w:val="18"/>
+        </w:rPr>
+        <w:t>Confirm the Easy scope and the four-class 2D OASIS target.</w:t>
+      </w:r>
+    </w:p>
+    <w:p>
+      <w:pPr>
+        <w:spacing w:after="40" w:line="240" w:lineRule="auto"/>
+        <w:ind w:left="115" w:hanging="115"/>
+      </w:pPr>
+      <w:r>
+        <w:rPr>
+          <w:b/>
+          <w:sz w:val="18"/>
+        </w:rPr>
+        <w:t xml:space="preserve">2. </w:t>
+      </w:r>
+      <w:r>
+        <w:rPr>
+          <w:sz w:val="18"/>
+        </w:rPr>
+        <w:t>Confirm Dice &gt;= 0.90 per label as the evaluation target and whether background is reported separately.</w:t>
+      </w:r>
+    </w:p>
+    <w:p>
+      <w:pPr>
+        <w:spacing w:after="40" w:line="240" w:lineRule="auto"/>
+        <w:ind w:left="115" w:hanging="115"/>
+      </w:pPr>
+      <w:r>
+        <w:rPr>
+          <w:b/>
+          <w:sz w:val="18"/>
+        </w:rPr>
+        <w:t xml:space="preserve">3. </w:t>
+      </w:r>
+      <w:r>
+        <w:rPr>
+          <w:sz w:val="18"/>
+        </w:rPr>
+        <w:t>Confirm the required training budget and acceptable evidence for the midpoint record.</w:t>
       </w:r>
     </w:p>
     <w:sectPr>

</xml_diff>